<commit_message>
feat: rappel DPAE a la validation, remise comptable par mail hebdo
- rappel DPAE devient un effet de valider() : plus d'etat RappelDpae ni de route
  dediee, part dans la meme requete avec poste/SIRET/lien
- remise = copie dans data/compta/ + un mail hebdomadaire par cabinet (RH en Cc) ;
  suppression du mail avis_comptable par dossier
- rejet envoye au manager_email fixe de l'etablissement, repli sur l'email saisi
- format de piece refuse avant toute ecriture : plus de 500 sur le formulaire
  public, plus de soumission a moitie nee sur le disque
- configurer.py : bilan lisible du garde-fou + assistant de config + gestion
  des comptes de connexion
- demo.py : demo bout-en-bout sur config_wingstop (data_demo/, --vide)
- verifier() refuse mails.rh / expediteur vides et url vide
- saisie_rh : libelle et aide optionnels par champ

.gitignore : notes de travail internes non versionnees
</commit_message>
<xml_diff>
--- a/config/contrats/fiche_salarie.docx
+++ b/config/contrats/fiche_salarie.docx
@@ -4,25 +4,15 @@
   <w:body>
     <w:p>
       <w:pPr>
-        <w:pStyle w:val="Title"/>
+        <w:pStyle w:val="Heading1"/>
       </w:pPr>
       <w:r>
-        <w:t>Fiche salarié</w:t>
-      </w:r>
-    </w:p>
-    <w:p>
-      <w:r>
-        <w:t>{{Societe}} — établissement {{Etablissement}}</w:t>
-      </w:r>
-    </w:p>
-    <w:p>
-      <w:r>
-        <w:t>Fiche établie le {{Aujourdhui}}.</w:t>
+        <w:t>FICHE SALARIÉ</w:t>
       </w:r>
     </w:p>
     <w:p>
       <w:pPr>
-        <w:pStyle w:val="Heading1"/>
+        <w:pStyle w:val="Heading2"/>
       </w:pPr>
       <w:r>
         <w:t>Identité</w:t>
@@ -30,98 +20,39 @@
     </w:p>
     <w:p>
       <w:r>
-        <w:t>Nom de naissance : {{NomNaissance}}</w:t>
+        <w:t xml:space="preserve">Nom et prénom : </w:t>
+      </w:r>
+      <w:r>
+        <w:rPr>
+          <w:b/>
+        </w:rPr>
+        <w:t>{{NomPrenom}}</w:t>
+      </w:r>
+    </w:p>
+    <w:p>
+      <w:pPr>
+        <w:pStyle w:val="Heading2"/>
+      </w:pPr>
+      <w:r>
+        <w:t>Pièces fournies</w:t>
       </w:r>
     </w:p>
     <w:p>
       <w:r>
-        <w:t>Nom d'usage : {{NomUsage}}</w:t>
+        <w:t>{{PiecesFournies}}</w:t>
+      </w:r>
+    </w:p>
+    <w:p>
+      <w:pPr>
+        <w:pStyle w:val="Heading2"/>
+      </w:pPr>
+      <w:r>
+        <w:t>Pièces manquantes</w:t>
       </w:r>
     </w:p>
     <w:p>
       <w:r>
-        <w:t>Prénom : {{Prenom}}</w:t>
-      </w:r>
-    </w:p>
-    <w:p>
-      <w:r>
-        <w:t>Date de naissance : {{DateNaissance}}</w:t>
-      </w:r>
-    </w:p>
-    <w:p>
-      <w:r>
-        <w:t>Lieu de naissance : {{LieuNaissance}}</w:t>
-      </w:r>
-    </w:p>
-    <w:p>
-      <w:r>
-        <w:t>Nationalité : {{Nationalite}}</w:t>
-      </w:r>
-    </w:p>
-    <w:p>
-      <w:r>
-        <w:t>Numéro de sécurité sociale : {{NumeroSecu}}</w:t>
-      </w:r>
-    </w:p>
-    <w:p>
-      <w:r>
-        <w:t>Adresse : {{Adresse}}</w:t>
-      </w:r>
-    </w:p>
-    <w:p>
-      <w:pPr>
-        <w:pStyle w:val="Heading1"/>
-      </w:pPr>
-      <w:r>
-        <w:t>Poste</w:t>
-      </w:r>
-    </w:p>
-    <w:p>
-      <w:r>
-        <w:t>Poste : {{Poste}}</w:t>
-      </w:r>
-    </w:p>
-    <w:p>
-      <w:r>
-        <w:t>Type de contrat : {{TypeContrat}}</w:t>
-      </w:r>
-    </w:p>
-    <w:p>
-      <w:r>
-        <w:t>Date de début : {{DateDebut}}</w:t>
-      </w:r>
-    </w:p>
-    <w:p>
-      <w:r>
-        <w:t>Heures hebdomadaires : {{HeuresHebdo}}</w:t>
-      </w:r>
-    </w:p>
-    <w:p>
-      <w:r>
-        <w:t>Salaire mensuel brut : {{SalaireChiffres}} €</w:t>
-      </w:r>
-    </w:p>
-    <w:p>
-      <w:r>
-        <w:t>Établissement : {{Etablissement}} ({{Siret}})</w:t>
-      </w:r>
-    </w:p>
-    <w:p>
-      <w:pPr>
-        <w:pStyle w:val="Heading1"/>
-      </w:pPr>
-      <w:r>
-        <w:t>Pièces au dossier</w:t>
-      </w:r>
-    </w:p>
-    <w:p>
-      <w:r>
-        <w:t>Fournies : {{PiecesFournies}}</w:t>
-      </w:r>
-    </w:p>
-    <w:p>
-      <w:r>
-        <w:t>Manquantes : {{PiecesManquantes}}</w:t>
+        <w:t>{{PiecesManquantes}}</w:t>
       </w:r>
     </w:p>
     <w:sectPr>

</xml_diff>